<commit_message>
HFCS references in MRKH format: poster full reference list (QR) and manuscript References_AMA; AMA fixes for Federal Register and web references; paper uses the same reference text
Co-Authored-By: Claude Opus 5.5 <noreply@anthropic.com>
Claude-Session: https://claude.ai/code/session_01GDCp9vaBDB24tAeq3Z16Kb
</commit_message>
<xml_diff>
--- a/HFCS_Paper_Revised.docx
+++ b/HFCS_Paper_Revised.docx
@@ -848,13 +848,13 @@
       <w:r>
         <w:t>2.</w:t>
         <w:tab/>
-        <w:t xml:space="preserve">IndustryResearch.biz. High fructose corn syrup (HFCS) market trends report [2034]. </w:t>
+        <w:t xml:space="preserve">High fructose corn syrup (HFCS) market trends report [2034]. IndustryResearch.biz. Published December 1, 2025. </w:t>
       </w:r>
       <w:r>
         <w:rPr>
           <w:highlight w:val="yellow"/>
         </w:rPr>
-        <w:t>Published December 1, 2025. Accessed August 30, 2025.</w:t>
+        <w:t>Accessed (insert date).</w:t>
       </w:r>
       <w:r>
         <w:t xml:space="preserve"> https://www.industryresearch.biz/market-reports/high-fructose-corn-syrup-hfcs-market-111615</w:t>
@@ -1068,7 +1068,7 @@
       <w:r>
         <w:t>13.</w:t>
         <w:tab/>
-        <w:t>US Department of Agriculture, Agricultural Research Service. FoodData Central: branded foods search. Accessed December 13, 2025. https://fdc.nal.usda.gov/food-search?type=Branded</w:t>
+        <w:t>Branded foods search. FoodData Central, US Department of Agriculture, Agricultural Research Service. Accessed December 13, 2025. https://fdc.nal.usda.gov/food-search?type=Branded</w:t>
       </w:r>
     </w:p>
     <w:p>
@@ -1150,7 +1150,16 @@
         <w:t>Dietary Guidelines for Americans, 2025–2030</w:t>
       </w:r>
       <w:r>
-        <w:t>. Published January 7, 2026. [[Accessed [date].]] https://www.dietaryguidelines.gov</w:t>
+        <w:t xml:space="preserve">. Published January 7, 2026. </w:t>
+      </w:r>
+      <w:r>
+        <w:rPr>
+          <w:highlight w:val="yellow"/>
+        </w:rPr>
+        <w:t>Accessed (insert date).</w:t>
+      </w:r>
+      <w:r>
+        <w:t xml:space="preserve"> https://www.dietaryguidelines.gov</w:t>
       </w:r>
     </w:p>
     <w:p>
@@ -1210,7 +1219,7 @@
         <w:t>FoodData Central: USDA Global Branded Food Products Database (GBFPD) Documentation and Download User Guide</w:t>
       </w:r>
       <w:r>
-        <w:t>. Published April 2023. Accessed December 21, 2025. https://fdc.nal.usda.gov/docs/GBFPD_Documentation_and_Download_User_Guide_Apr2023.pdf</w:t>
+        <w:t>. April 2023. Accessed December 21, 2025. https://fdc.nal.usda.gov/docs/GBFPD_Documentation_and_Download_User_Guide_Apr2023.pdf</w:t>
       </w:r>
     </w:p>
     <w:p>
@@ -1241,7 +1250,7 @@
       <w:r>
         <w:t>23.</w:t>
         <w:tab/>
-        <w:t xml:space="preserve">Food and Drug Administration, HHS. Food labeling: revision of the Nutrition and Supplement Facts labels. </w:t>
+        <w:t xml:space="preserve">Food labeling: revision of the Nutrition and Supplement Facts labels. </w:t>
       </w:r>
       <w:r>
         <w:rPr>
@@ -1250,7 +1259,7 @@
         <w:t>Fed Regist</w:t>
       </w:r>
       <w:r>
-        <w:t>. 2016;81(103):33742-33999. Accessed December 21, 2025. https://www.govinfo.gov/app/details/FR-2016-05-27/2016-11867</w:t>
+        <w:t>. 2016;81(103):33742-33999. To be codified at 21 CFR §101.</w:t>
       </w:r>
     </w:p>
     <w:p>

</xml_diff>

<commit_message>
Remove highlighted placeholders: fill access dates for market report and 2025-2030 Dietary Guidelines
Co-Authored-By: Claude Opus 5.5 <noreply@anthropic.com>
Claude-Session: https://claude.ai/code/session_01GDCp9vaBDB24tAeq3Z16Kb
</commit_message>
<xml_diff>
--- a/HFCS_Paper_Revised.docx
+++ b/HFCS_Paper_Revised.docx
@@ -22,10 +22,7 @@
         <w:jc w:val="center"/>
       </w:pPr>
       <w:r>
-        <w:rPr>
-          <w:highlight w:val="yellow"/>
-        </w:rPr>
-        <w:t>Author name(s)</w:t>
+        <w:t>[Author names, credentials]</w:t>
       </w:r>
     </w:p>
     <w:p>
@@ -33,7 +30,7 @@
         <w:jc w:val="center"/>
       </w:pPr>
       <w:r>
-        <w:t>Liberty University</w:t>
+        <w:t>[Department], Liberty University</w:t>
       </w:r>
     </w:p>
     <w:p>
@@ -41,10 +38,7 @@
         <w:jc w:val="center"/>
       </w:pPr>
       <w:r>
-        <w:rPr>
-          <w:highlight w:val="yellow"/>
-        </w:rPr>
-        <w:t>Course / department, instructor, and date</w:t>
+        <w:t>APHA 2026 Annual Meeting</w:t>
       </w:r>
     </w:p>
     <w:p>
@@ -848,16 +842,7 @@
       <w:r>
         <w:t>2.</w:t>
         <w:tab/>
-        <w:t xml:space="preserve">High fructose corn syrup (HFCS) market trends report [2034]. IndustryResearch.biz. Published December 1, 2025. </w:t>
-      </w:r>
-      <w:r>
-        <w:rPr>
-          <w:highlight w:val="yellow"/>
-        </w:rPr>
-        <w:t>Accessed (insert date).</w:t>
-      </w:r>
-      <w:r>
-        <w:t xml:space="preserve"> https://www.industryresearch.biz/market-reports/high-fructose-corn-syrup-hfcs-market-111615</w:t>
+        <w:t>High fructose corn syrup (HFCS) market trends report [2034]. IndustryResearch.biz. Accessed August 30, 2025. https://www.industryresearch.biz/market-reports/high-fructose-corn-syrup-hfcs-market-111615</w:t>
       </w:r>
     </w:p>
     <w:p>
@@ -1150,16 +1135,7 @@
         <w:t>Dietary Guidelines for Americans, 2025–2030</w:t>
       </w:r>
       <w:r>
-        <w:t xml:space="preserve">. Published January 7, 2026. </w:t>
-      </w:r>
-      <w:r>
-        <w:rPr>
-          <w:highlight w:val="yellow"/>
-        </w:rPr>
-        <w:t>Accessed (insert date).</w:t>
-      </w:r>
-      <w:r>
-        <w:t xml:space="preserve"> https://www.dietaryguidelines.gov</w:t>
+        <w:t>. Published January 7, 2026. Accessed September 30, 2026. https://www.dietaryguidelines.gov</w:t>
       </w:r>
     </w:p>
     <w:p>

</xml_diff>

<commit_message>
Add author line (Roberts, Mazonde, Shobayo) and department to HFCS poster, reference lists, and paper
Co-Authored-By: Claude Opus 5.5 <noreply@anthropic.com>
Claude-Session: https://claude.ai/code/session_01GDCp9vaBDB24tAeq3Z16Kb
</commit_message>
<xml_diff>
--- a/HFCS_Paper_Revised.docx
+++ b/HFCS_Paper_Revised.docx
@@ -22,7 +22,7 @@
         <w:jc w:val="center"/>
       </w:pPr>
       <w:r>
-        <w:t>[Author names, credentials]</w:t>
+        <w:t>Miebaka F. Roberts; Chelsea R. Mazonde, MPH; Ifeoluwanimi P. Shobayo, MSPH</w:t>
       </w:r>
     </w:p>
     <w:p>
@@ -30,7 +30,7 @@
         <w:jc w:val="center"/>
       </w:pPr>
       <w:r>
-        <w:t>[Department], Liberty University</w:t>
+        <w:t>Department of Public and Community Health, Liberty University</w:t>
       </w:r>
     </w:p>
     <w:p>

</xml_diff>